<commit_message>
D-20: la categoría más baja pasa a llamarse Desaprobado
Renombra "Riesgo Crítico / Abandono" a "Desaprobado" en código, tests, app, CLI,
salidas regeneradas, README, CLAUDE.md, informe, registro, glosario, esquema y figuras.
Los límites (nota < 4) y las métricas no cambian.

Co-Authored-By: Claude Opus 5.5 <noreply@anthropic.com>
Claude-Session: https://claude.ai/code/session_01D27XouMxJd6fTUbCw1jxqD
</commit_message>
<xml_diff>
--- a/docs/Esquema_arquitectura_TFI.docx
+++ b/docs/Esquema_arquitectura_TFI.docx
@@ -150,7 +150,7 @@
       <w:r>
         <w:drawing>
           <wp:inline distT="0" distB="0" distL="0" distR="0">
-            <wp:extent cx="6477000" cy="3200400"/>
+            <wp:extent cx="6477000" cy="3198018"/>
             <wp:effectExtent t="0" r="0" b="0" l="0"/>
             <wp:docPr id="1" name="" descr="" title=""/>
             <wp:cNvGraphicFramePr>
@@ -175,7 +175,7 @@
                   <pic:spPr bwMode="auto">
                     <a:xfrm>
                       <a:off x="0" y="0"/>
-                      <a:ext cx="6477000" cy="3200400"/>
+                      <a:ext cx="6477000" cy="3198018"/>
                     </a:xfrm>
                     <a:prstGeom prst="rect">
                       <a:avLst/>
@@ -338,7 +338,7 @@
       <w:r>
         <w:drawing>
           <wp:inline distT="0" distB="0" distL="0" distR="0">
-            <wp:extent cx="6477000" cy="3314700"/>
+            <wp:extent cx="6477000" cy="3315414"/>
             <wp:effectExtent t="0" r="0" b="0" l="0"/>
             <wp:docPr id="1" name="" descr="" title=""/>
             <wp:cNvGraphicFramePr>
@@ -363,7 +363,7 @@
                   <pic:spPr bwMode="auto">
                     <a:xfrm>
                       <a:off x="0" y="0"/>
-                      <a:ext cx="6477000" cy="3314700"/>
+                      <a:ext cx="6477000" cy="3315414"/>
                     </a:xfrm>
                     <a:prstGeom prst="rect">
                       <a:avLst/>
@@ -711,7 +711,7 @@
       <w:r>
         <w:drawing>
           <wp:inline distT="0" distB="0" distL="0" distR="0">
-            <wp:extent cx="6477000" cy="2981325"/>
+            <wp:extent cx="6477000" cy="2979420"/>
             <wp:effectExtent t="0" r="0" b="0" l="0"/>
             <wp:docPr id="1" name="" descr="" title=""/>
             <wp:cNvGraphicFramePr>
@@ -736,7 +736,7 @@
                   <pic:spPr bwMode="auto">
                     <a:xfrm>
                       <a:off x="0" y="0"/>
-                      <a:ext cx="6477000" cy="2981325"/>
+                      <a:ext cx="6477000" cy="2979420"/>
                     </a:xfrm>
                     <a:prstGeom prst="rect">
                       <a:avLst/>

</xml_diff>